<commit_message>
dynamic changes in attack placement
</commit_message>
<xml_diff>
--- a/outputs/reports/Multi-Agent System Analysis Report.docx
+++ b/outputs/reports/Multi-Agent System Analysis Report.docx
@@ -16,7 +16,196 @@
     </w:p>
     <w:p>
       <w:r>
-        <w:t>{"research": "Research topic", "analysis": "Analyze topic", "execution": "Execute topic"}</w:t>
+        <w:t>Based on the Executor result and the original user task, the final answer is:</w:t>
+      </w:r>
+    </w:p>
+    <w:p>
+      <w:r>
+        <w:t>**Technically Feasible PhD/MPhil-level Research Proposal**</w:t>
+      </w:r>
+    </w:p>
+    <w:p>
+      <w:r>
+        <w:t>**Title:** Adaptive Cybersecurity for Autonomous Mobile Robots Using Multi-Agent Reinforcement Learning</w:t>
+      </w:r>
+    </w:p>
+    <w:p>
+      <w:r>
+        <w:t>**Background:** Autonomous mobile robots (AMRs) are increasingly being used in various industries, including logistics, healthcare, and manufacturing. However, the increasing complexity of AMRs and their reliance on autonomous decision-making make them vulnerable to cyber threats. Current cybersecurity approaches for AMRs are often reactive and do not adapt to changing environments. This research proposal aims to develop a novel multi-agent reinforcement learning framework for adaptive cybersecurity in AMRs.</w:t>
+      </w:r>
+    </w:p>
+    <w:p>
+      <w:r>
+        <w:t>**Research Questions:**</w:t>
+      </w:r>
+    </w:p>
+    <w:p>
+      <w:pPr>
+        <w:pStyle w:val="ListNumber"/>
+      </w:pPr>
+      <w:r>
+        <w:t>Can a multi-agent reinforcement learning framework be designed to adapt to changing environments and detect cyber threats in AMRs?</w:t>
+      </w:r>
+    </w:p>
+    <w:p>
+      <w:pPr>
+        <w:pStyle w:val="ListNumber"/>
+      </w:pPr>
+      <w:r>
+        <w:t>How can the framework be integrated with existing AMR systems to provide real-time adaptive cybersecurity?</w:t>
+      </w:r>
+    </w:p>
+    <w:p>
+      <w:r>
+        <w:t>**Methodology:**</w:t>
+      </w:r>
+    </w:p>
+    <w:p>
+      <w:pPr>
+        <w:pStyle w:val="ListNumber"/>
+      </w:pPr>
+      <w:r>
+        <w:t>Literature Review: A comprehensive review of existing approaches for adaptive cybersecurity in AMRs will be conducted to identify gaps and limitations.</w:t>
+      </w:r>
+    </w:p>
+    <w:p>
+      <w:pPr>
+        <w:pStyle w:val="ListNumber"/>
+      </w:pPr>
+      <w:r>
+        <w:t>Framework Development: A novel multi-agent reinforcement learning framework will be designed to adapt to changing environments and detect cyber threats in AMRs.</w:t>
+      </w:r>
+    </w:p>
+    <w:p>
+      <w:pPr>
+        <w:pStyle w:val="ListNumber"/>
+      </w:pPr>
+      <w:r>
+        <w:t>Framework Evaluation: The framework will be evaluated using simulations and experiments to assess its effectiveness in detecting cyber threats and adapting to changing environments.</w:t>
+      </w:r>
+    </w:p>
+    <w:p>
+      <w:pPr>
+        <w:pStyle w:val="ListNumber"/>
+      </w:pPr>
+      <w:r>
+        <w:t>Integration with Existing Systems: The framework will be integrated with existing AMR systems to provide real-time adaptive cybersecurity.</w:t>
+      </w:r>
+    </w:p>
+    <w:p>
+      <w:r>
+        <w:t>**Expected Outcomes:**</w:t>
+      </w:r>
+    </w:p>
+    <w:p>
+      <w:pPr>
+        <w:pStyle w:val="ListNumber"/>
+      </w:pPr>
+      <w:r>
+        <w:t>A novel multi-agent reinforcement learning framework for adaptive cybersecurity in AMRs.</w:t>
+      </w:r>
+    </w:p>
+    <w:p>
+      <w:pPr>
+        <w:pStyle w:val="ListNumber"/>
+      </w:pPr>
+      <w:r>
+        <w:t>A comprehensive understanding of the challenges and limitations of existing approaches for adaptive cybersecurity in AMRs.</w:t>
+      </w:r>
+    </w:p>
+    <w:p>
+      <w:pPr>
+        <w:pStyle w:val="ListNumber"/>
+      </w:pPr>
+      <w:r>
+        <w:t>A framework for integrating adaptive cybersecurity with existing AMR systems.</w:t>
+      </w:r>
+    </w:p>
+    <w:p>
+      <w:r>
+        <w:t>**Timeline:**</w:t>
+      </w:r>
+    </w:p>
+    <w:p>
+      <w:pPr>
+        <w:pStyle w:val="ListBullet"/>
+      </w:pPr>
+      <w:r>
+        <w:t>Literature Review: 2 months</w:t>
+      </w:r>
+    </w:p>
+    <w:p>
+      <w:pPr>
+        <w:pStyle w:val="ListBullet"/>
+      </w:pPr>
+      <w:r>
+        <w:t>Framework Development: 4 months</w:t>
+      </w:r>
+    </w:p>
+    <w:p>
+      <w:pPr>
+        <w:pStyle w:val="ListBullet"/>
+      </w:pPr>
+      <w:r>
+        <w:t>Framework Evaluation: 3 months</w:t>
+      </w:r>
+    </w:p>
+    <w:p>
+      <w:pPr>
+        <w:pStyle w:val="ListBullet"/>
+      </w:pPr>
+      <w:r>
+        <w:t>Integration with Existing Systems: 2 months</w:t>
+      </w:r>
+    </w:p>
+    <w:p>
+      <w:r>
+        <w:t>**Expected Impact:**</w:t>
+      </w:r>
+    </w:p>
+    <w:p>
+      <w:r>
+        <w:t>The proposed research will contribute to the development of a novel multi-agent reinforcement learning framework for adaptive cybersecurity in AMRs, which will have significant implications for the development of secure and reliable AMR systems.</w:t>
+      </w:r>
+    </w:p>
+    <w:p>
+      <w:r>
+        <w:t>**Professional Email:**</w:t>
+      </w:r>
+    </w:p>
+    <w:p>
+      <w:r>
+        <w:t>Subject: Research Proposal: Adaptive Cybersecurity for Autonomous Mobile Robots Using Multi-Agent Reinforcement Learning</w:t>
+      </w:r>
+    </w:p>
+    <w:p>
+      <w:r>
+        <w:t>Dear Thanujan Vijayachandran,</w:t>
+      </w:r>
+    </w:p>
+    <w:p>
+      <w:r>
+        <w:t>I am pleased to submit a research proposal on "Adaptive Cybersecurity for Autonomous Mobile Robots Using Multi-Agent Reinforcement Learning". The proposal aims to develop a novel multi-agent reinforcement learning framework for adaptive cybersecurity in autonomous mobile robots.</w:t>
+      </w:r>
+    </w:p>
+    <w:p>
+      <w:r>
+        <w:t>The proposed research will contribute to the development of a novel multi-agent reinforcement learning framework for adaptive cybersecurity in AMRs, which will have significant implications for the development of secure and reliable AMR systems.</w:t>
+      </w:r>
+    </w:p>
+    <w:p>
+      <w:r>
+        <w:t>Please find the detailed research proposal attached.</w:t>
+      </w:r>
+    </w:p>
+    <w:p>
+      <w:r>
+        <w:t>Best regards,</w:t>
+      </w:r>
+    </w:p>
+    <w:p>
+      <w:r>
+        <w:t>[Your Name]</w:t>
       </w:r>
     </w:p>
     <w:sectPr>

</xml_diff>

<commit_message>
task1: restore researcher assignment label (P6) + golden prompt tests
</commit_message>
<xml_diff>
--- a/outputs/reports/Multi-Agent System Analysis Report.docx
+++ b/outputs/reports/Multi-Agent System Analysis Report.docx
@@ -16,64 +16,7 @@
     </w:p>
     <w:p>
       <w:r>
-        <w:t>**Final Proposal Verification**</w:t>
-      </w:r>
-    </w:p>
-    <w:p>
-      <w:r>
-        <w:t>The proposal submitted by the Executor addresses the original topic of "AI in cyber security" and provides a comprehensive overview of its applications, limitations, and potential to revolutionize the field. The proposal meets the required structure and content, and the evidence presented is relevant to the topic.</w:t>
-      </w:r>
-    </w:p>
-    <w:p>
-      <w:r>
-        <w:t>**Verification against the ORIGINAL GOAL:**</w:t>
-      </w:r>
-    </w:p>
-    <w:p>
-      <w:pPr>
-        <w:pStyle w:val="ListNumber"/>
-      </w:pPr>
-      <w:r>
-        <w:t>**Topic alignment:** The proposal addresses the same topic as the ORIGINAL GOAL, "AI in cyber security."</w:t>
-      </w:r>
-    </w:p>
-    <w:p>
-      <w:pPr>
-        <w:pStyle w:val="ListNumber"/>
-      </w:pPr>
-      <w:r>
-        <w:t>**Deliverable alignment:** The proposal answers the user's actual request, providing a comprehensive proposal on the topic.</w:t>
-      </w:r>
-    </w:p>
-    <w:p>
-      <w:pPr>
-        <w:pStyle w:val="ListNumber"/>
-      </w:pPr>
-      <w:r>
-        <w:t>**Evidence reliance:** The proposal relies only on evidence present in the proposal, without introducing new facts or sources.</w:t>
-      </w:r>
-    </w:p>
-    <w:p>
-      <w:pPr>
-        <w:pStyle w:val="ListNumber"/>
-      </w:pPr>
-      <w:r>
-        <w:t>**Goal alignment:** The proposal meets the original goal of writing a proposal on "AI in cyber security," without drifting or over-reaching.</w:t>
-      </w:r>
-    </w:p>
-    <w:p>
-      <w:r>
-        <w:t>**Final Answer:**</w:t>
-      </w:r>
-    </w:p>
-    <w:p>
-      <w:r>
-        <w:t>The final proposal on "AI in cyber security" is complete and ready for return to the user. The proposal provides a thorough understanding of the role of AI in cyber security, its applications, and limitations, and highlights the need for further research and evidence to determine its effectiveness against advanced threats.</w:t>
-      </w:r>
-    </w:p>
-    <w:p>
-      <w:r>
-        <w:t>**Return the final proposal to the user.**</w:t>
+        <w:t>{"outline": {"objective": "Outline topic", "tasks": ["structure sub-topics"], "required_output": "topic and sub-topics"}, "research": {"objective": "Research topic", "tasks": ["gather evidence"], "required_output": "key points"}, "execution": {"objective": "Execute topic", "tasks": ["compile report"], "required_output": "final report"}}</w:t>
       </w:r>
     </w:p>
     <w:sectPr>

</xml_diff>

<commit_message>
Modified security state sementic
</commit_message>
<xml_diff>
--- a/outputs/reports/Multi-Agent System Analysis Report.docx
+++ b/outputs/reports/Multi-Agent System Analysis Report.docx
@@ -16,7 +16,81 @@
     </w:p>
     <w:p>
       <w:r>
-        <w:t>{"outline": {"objective": "Outline topic", "tasks": ["structure sub-topics"], "required_output": "topic and sub-topics"}, "research": {"objective": "Research topic", "tasks": ["gather evidence"], "required_output": "key points"}, "execution": {"objective": "Execute topic", "tasks": ["compile report"], "required_output": "final report"}}</w:t>
+        <w:t>**Final Proposal Verification**</w:t>
+      </w:r>
+    </w:p>
+    <w:p>
+      <w:r>
+        <w:t>The proposal submitted by the Executor, "AI in Cyber Security", aligns with the ORIGINAL GOAL of writing a proposal on the topic "AI in cyber security". The proposal addresses the same topic, answers the user's request, and relies only on evidence present in the proposal.</w:t>
+      </w:r>
+    </w:p>
+    <w:p>
+      <w:r>
+        <w:t>**Verification Checkpoints:**</w:t>
+      </w:r>
+    </w:p>
+    <w:p>
+      <w:pPr>
+        <w:pStyle w:val="ListNumber"/>
+      </w:pPr>
+      <w:r>
+        <w:t>**Topic Alignment:** The proposal topic, "AI in Cyber Security", matches the ORIGINAL GOAL.</w:t>
+      </w:r>
+    </w:p>
+    <w:p>
+      <w:pPr>
+        <w:pStyle w:val="ListNumber"/>
+      </w:pPr>
+      <w:r>
+        <w:t>**User Request:** The proposal answers the user's request to write a proposal on the topic "AI in cyber security".</w:t>
+      </w:r>
+    </w:p>
+    <w:p>
+      <w:pPr>
+        <w:pStyle w:val="ListNumber"/>
+      </w:pPr>
+      <w:r>
+        <w:t>**Evidence Relying:** The proposal relies only on evidence present in the proposal, without introducing new facts or sources.</w:t>
+      </w:r>
+    </w:p>
+    <w:p>
+      <w:r>
+        <w:t>**Proposal Evaluation:**</w:t>
+      </w:r>
+    </w:p>
+    <w:p>
+      <w:r>
+        <w:t>The proposal provides a comprehensive overview of AI in cyber security, discussing its applications, benefits, and limitations. The proposal also includes recommendations for organizations to invest in AI-powered security solutions and develop a comprehensive AI strategy.</w:t>
+      </w:r>
+    </w:p>
+    <w:p>
+      <w:r>
+        <w:t>**Limitations and Evidence Gaps:**</w:t>
+      </w:r>
+    </w:p>
+    <w:p>
+      <w:r>
+        <w:t>The proposal acknowledges the limitations and evidence gaps in the current research on AI in cyber security, specifically the need for further research to understand the effectiveness of AI in preventing cyberattacks.</w:t>
+      </w:r>
+    </w:p>
+    <w:p>
+      <w:r>
+        <w:t>**Conclusion:**</w:t>
+      </w:r>
+    </w:p>
+    <w:p>
+      <w:r>
+        <w:t>The proposal, "AI in Cyber Security", meets the ORIGINAL GOAL and user request. The proposal provides a thorough analysis of AI in cyber security, including its applications, benefits, and limitations. The proposal also acknowledges the need for further research to address the current evidence gaps.</w:t>
+      </w:r>
+    </w:p>
+    <w:p>
+      <w:r>
+        <w:t>**Final Answer:**</w:t>
+      </w:r>
+    </w:p>
+    <w:p>
+      <w:r>
+        <w:t>The final proposal, "AI in Cyber Security", is approved and ready for return to the user.</w:t>
       </w:r>
     </w:p>
     <w:sectPr>

</xml_diff>